<commit_message>
Reorganize Data/ into numbered process folders, add new owner reports, ignore large video/lock files
- Move Data/Evaluation and root Data files into Data/1.PO .. Data/8.Parking slip structure (Andy's manual reorg)
- Add new Owner reports (BAO_CAO_TRINH_OWNER_QUY_TRINH, DANH_GIA_KIEN_TRUC_HE_THONG, PARTCONTROL_CAP_NHAT_DUYET, EMAIL_GUI_OWNER) and their .docx exports
- Update LATEST_SESSION.md, BAO_CAO_TONG_HOP_AVP, THIET_KE_HE_THONG_MOI for SES-20260915-002
- Ignore *.wmv (large screen recordings) and Office ~$*.docx lock files in .gitignore

Co-Authored-By: Claude Sonnet 5 <noreply@anthropic.com>
</commit_message>
<xml_diff>
--- a/Report/BAO_CAO_TONG_HOP_AVP.docx
+++ b/Report/BAO_CAO_TONG_HOP_AVP.docx
@@ -2377,6 +2377,176 @@
     <w:p/>
     <w:p>
       <w:pPr>
+        <w:ind w:left="720"/>
+      </w:pPr>
+      <w:r>
+        <w:rPr>
+          <w:i/>
+          <w:color w:val="444444"/>
+          <w:sz w:val="26"/>
+        </w:rPr>
+        <w:t>**Ghi chú thêm 2026-09-14 (trao đổi trực tiếp với Andy, chưa xác minh</w:t>
+      </w:r>
+    </w:p>
+    <w:p>
+      <w:pPr>
+        <w:ind w:left="720"/>
+      </w:pPr>
+      <w:r>
+        <w:rPr>
+          <w:i/>
+          <w:color w:val="444444"/>
+          <w:sz w:val="26"/>
+        </w:rPr>
+        <w:t>bằng số liệu)**: nguyên nhân thực tế rất có thể là **PO/nguyên liệu mới</w:t>
+      </w:r>
+    </w:p>
+    <w:p>
+      <w:pPr>
+        <w:ind w:left="720"/>
+      </w:pPr>
+      <w:r>
+        <w:rPr>
+          <w:i/>
+          <w:color w:val="444444"/>
+          <w:sz w:val="26"/>
+        </w:rPr>
+        <w:t>có ngày về trễ tới 12h trưa** — công nhân "gối đầu" làm nốt phần còn</w:t>
+      </w:r>
+    </w:p>
+    <w:p>
+      <w:pPr>
+        <w:ind w:left="720"/>
+      </w:pPr>
+      <w:r>
+        <w:rPr>
+          <w:i/>
+          <w:color w:val="444444"/>
+          <w:sz w:val="26"/>
+        </w:rPr>
+        <w:t>lại của PO/traveler hôm trước trên CÙNG máy đó trong lúc chờ, rồi</w:t>
+      </w:r>
+    </w:p>
+    <w:p>
+      <w:pPr>
+        <w:ind w:left="720"/>
+      </w:pPr>
+      <w:r>
+        <w:rPr>
+          <w:i/>
+          <w:color w:val="444444"/>
+          <w:sz w:val="26"/>
+        </w:rPr>
+        <w:t>traveler mới nạp lên máy khi PO về buổi trưa. Đây có thể là cách vận</w:t>
+      </w:r>
+    </w:p>
+    <w:p>
+      <w:pPr>
+        <w:ind w:left="720"/>
+      </w:pPr>
+      <w:r>
+        <w:rPr>
+          <w:i/>
+          <w:color w:val="444444"/>
+          <w:sz w:val="26"/>
+        </w:rPr>
+        <w:t>hành HỢP LÝ, không phải lỗi ghi nhận — nhưng hệ thống hiện tại không có</w:t>
+      </w:r>
+    </w:p>
+    <w:p>
+      <w:pPr>
+        <w:ind w:left="720"/>
+      </w:pPr>
+      <w:r>
+        <w:rPr>
+          <w:i/>
+          <w:color w:val="444444"/>
+          <w:sz w:val="26"/>
+        </w:rPr>
+        <w:t>ranh giới rõ ràng "lúc nào máy chuyển từ traveler A sang traveler B",</w:t>
+      </w:r>
+    </w:p>
+    <w:p>
+      <w:pPr>
+        <w:ind w:left="720"/>
+      </w:pPr>
+      <w:r>
+        <w:rPr>
+          <w:i/>
+          <w:color w:val="444444"/>
+          <w:sz w:val="26"/>
+        </w:rPr>
+        <w:t>nên hao hụt vẫn bị tính lẫn giữa 2 lô. **Cần Owner/quản lý xác nhận**:</w:t>
+      </w:r>
+    </w:p>
+    <w:p>
+      <w:pPr>
+        <w:ind w:left="720"/>
+      </w:pPr>
+      <w:r>
+        <w:rPr>
+          <w:i/>
+          <w:color w:val="444444"/>
+          <w:sz w:val="26"/>
+        </w:rPr>
+        <w:t>việc gối đầu này do công nhân tự quyết khi thấy PO chưa về, hay có</w:t>
+      </w:r>
+    </w:p>
+    <w:p>
+      <w:pPr>
+        <w:ind w:left="720"/>
+      </w:pPr>
+      <w:r>
+        <w:rPr>
+          <w:i/>
+          <w:color w:val="444444"/>
+          <w:sz w:val="26"/>
+        </w:rPr>
+        <w:t>quản lý/kế hoạch chỉ định rõ mỗi sáng? Nếu xác nhận đúng, đây là 1 lợi</w:t>
+      </w:r>
+    </w:p>
+    <w:p>
+      <w:pPr>
+        <w:ind w:left="720"/>
+      </w:pPr>
+      <w:r>
+        <w:rPr>
+          <w:i/>
+          <w:color w:val="444444"/>
+          <w:sz w:val="26"/>
+        </w:rPr>
+        <w:t>ích cụ thể thêm của Goods Receipt (mục 1 hàng #2) — hiển thị "PO hôm</w:t>
+      </w:r>
+    </w:p>
+    <w:p>
+      <w:pPr>
+        <w:ind w:left="720"/>
+      </w:pPr>
+      <w:r>
+        <w:rPr>
+          <w:i/>
+          <w:color w:val="444444"/>
+          <w:sz w:val="26"/>
+        </w:rPr>
+        <w:t>nay đã về hay chưa" giúp kế hoạch/công nhân chủ động gối đầu thay vì tự</w:t>
+      </w:r>
+    </w:p>
+    <w:p>
+      <w:pPr>
+        <w:ind w:left="720"/>
+      </w:pPr>
+      <w:r>
+        <w:rPr>
+          <w:i/>
+          <w:color w:val="444444"/>
+          <w:sz w:val="26"/>
+        </w:rPr>
+        <w:t>đoán.</w:t>
+      </w:r>
+    </w:p>
+    <w:p/>
+    <w:p>
+      <w:pPr>
         <w:pBdr>
           <w:top w:val="single" w:sz="4" w:space="4" w:color="AAAAAA"/>
           <w:left w:val="single" w:sz="4" w:space="4" w:color="AAAAAA"/>
@@ -3767,6 +3937,383 @@
     </w:p>
     <w:p/>
     <w:p>
+      <w:pPr>
+        <w:ind w:left="720"/>
+      </w:pPr>
+      <w:r>
+        <w:rPr>
+          <w:i/>
+          <w:color w:val="444444"/>
+          <w:sz w:val="26"/>
+        </w:rPr>
+        <w:t>**Chi tiết đề xuất "ma trận Máy × Part#" (trao đổi 2026-09-14)** — Andy</w:t>
+      </w:r>
+    </w:p>
+    <w:p>
+      <w:pPr>
+        <w:ind w:left="720"/>
+      </w:pPr>
+      <w:r>
+        <w:rPr>
+          <w:i/>
+          <w:color w:val="444444"/>
+          <w:sz w:val="26"/>
+        </w:rPr>
+        <w:t>nêu tình huống thật: 10 máy (1-10), mỗi máy tính chất khác nhau (lựa</w:t>
+      </w:r>
+    </w:p>
+    <w:p>
+      <w:pPr>
+        <w:ind w:left="720"/>
+      </w:pPr>
+      <w:r>
+        <w:rPr>
+          <w:i/>
+          <w:color w:val="444444"/>
+          <w:sz w:val="26"/>
+        </w:rPr>
+        <w:t>được part nhỏ/lớn khác nhau, công suất khác nhau, số người vận hành</w:t>
+      </w:r>
+    </w:p>
+    <w:p>
+      <w:pPr>
+        <w:ind w:left="720"/>
+      </w:pPr>
+      <w:r>
+        <w:rPr>
+          <w:i/>
+          <w:color w:val="444444"/>
+          <w:sz w:val="26"/>
+        </w:rPr>
+        <w:t>khác nhau, sự cố không biết máy nào ảnh hưởng); 1 PO có 6 traveler</w:t>
+      </w:r>
+    </w:p>
+    <w:p>
+      <w:pPr>
+        <w:ind w:left="720"/>
+      </w:pPr>
+      <w:r>
+        <w:rPr>
+          <w:i/>
+          <w:color w:val="444444"/>
+          <w:sz w:val="26"/>
+        </w:rPr>
+        <w:t>(A-F), có traveler cùng Part#, có traveler khác Part# — gọi đây là "ma</w:t>
+      </w:r>
+    </w:p>
+    <w:p>
+      <w:pPr>
+        <w:ind w:left="720"/>
+      </w:pPr>
+      <w:r>
+        <w:rPr>
+          <w:i/>
+          <w:color w:val="444444"/>
+          <w:sz w:val="26"/>
+        </w:rPr>
+        <w:t>trận trong sản xuất", nghi đây là lý do công ty chưa dám áp dụng hệ</w:t>
+      </w:r>
+    </w:p>
+    <w:p>
+      <w:pPr>
+        <w:ind w:left="720"/>
+      </w:pPr>
+      <w:r>
+        <w:rPr>
+          <w:i/>
+          <w:color w:val="444444"/>
+          <w:sz w:val="26"/>
+        </w:rPr>
+        <w:t>thống. Đề xuất giải quyết KHÔNG cần thuật toán tối ưu (APS) ngay từ</w:t>
+      </w:r>
+    </w:p>
+    <w:p>
+      <w:pPr>
+        <w:ind w:left="720"/>
+      </w:pPr>
+      <w:r>
+        <w:rPr>
+          <w:i/>
+          <w:color w:val="444444"/>
+          <w:sz w:val="26"/>
+        </w:rPr>
+        <w:t>đầu — chỉ cần 3 bảng dữ liệu đơn giản, con người vẫn quyết định, hệ</w:t>
+      </w:r>
+    </w:p>
+    <w:p>
+      <w:pPr>
+        <w:ind w:left="720"/>
+      </w:pPr>
+      <w:r>
+        <w:rPr>
+          <w:i/>
+          <w:color w:val="444444"/>
+          <w:sz w:val="26"/>
+        </w:rPr>
+        <w:t>thống chỉ hỗ trợ nhìn rõ + cảnh báo sai:</w:t>
+      </w:r>
+    </w:p>
+    <w:p>
+      <w:pPr/>
+      <w:r>
+        <w:t>&gt;</w:t>
+      </w:r>
+    </w:p>
+    <w:p>
+      <w:pPr>
+        <w:ind w:left="720"/>
+      </w:pPr>
+      <w:r>
+        <w:rPr>
+          <w:i/>
+          <w:color w:val="444444"/>
+          <w:sz w:val="26"/>
+        </w:rPr>
+        <w:t>1. **Work Center Master (Bảng máy)**: mỗi máy 1 dòng — MC#, loại</w:t>
+      </w:r>
+    </w:p>
+    <w:p>
+      <w:pPr>
+        <w:ind w:left="720"/>
+      </w:pPr>
+      <w:r>
+        <w:rPr>
+          <w:i/>
+          <w:color w:val="444444"/>
+          <w:sz w:val="26"/>
+        </w:rPr>
+        <w:t xml:space="preserve">   size lựa được (nhỏ/lớn/cả hai), công suất (pcs/giờ), số người vận</w:t>
+      </w:r>
+    </w:p>
+    <w:p>
+      <w:pPr>
+        <w:ind w:left="720"/>
+      </w:pPr>
+      <w:r>
+        <w:rPr>
+          <w:i/>
+          <w:color w:val="444444"/>
+          <w:sz w:val="26"/>
+        </w:rPr>
+        <w:t xml:space="preserve">   hành cần, trạng thái hiện tại (Đang chạy/Dừng/Bảo trì) + lý do dừng.</w:t>
+      </w:r>
+    </w:p>
+    <w:p>
+      <w:pPr>
+        <w:ind w:left="720"/>
+      </w:pPr>
+      <w:r>
+        <w:rPr>
+          <w:i/>
+          <w:color w:val="444444"/>
+          <w:sz w:val="26"/>
+        </w:rPr>
+        <w:t>2. **Part↔Machine Compatibility**: Part# (hoặc nhóm theo size) → danh</w:t>
+      </w:r>
+    </w:p>
+    <w:p>
+      <w:pPr>
+        <w:ind w:left="720"/>
+      </w:pPr>
+      <w:r>
+        <w:rPr>
+          <w:i/>
+          <w:color w:val="444444"/>
+          <w:sz w:val="26"/>
+        </w:rPr>
+        <w:t xml:space="preserve">   sách máy tương thích — trả lời "máy nào lựa loại nhỏ, máy nào lựa</w:t>
+      </w:r>
+    </w:p>
+    <w:p>
+      <w:pPr>
+        <w:ind w:left="720"/>
+      </w:pPr>
+      <w:r>
+        <w:rPr>
+          <w:i/>
+          <w:color w:val="444444"/>
+          <w:sz w:val="26"/>
+        </w:rPr>
+        <w:t xml:space="preserve">   loại lớn". Đây là phần duy nhất cần công sức nhập liệu ban đầu (1</w:t>
+      </w:r>
+    </w:p>
+    <w:p>
+      <w:pPr>
+        <w:ind w:left="720"/>
+      </w:pPr>
+      <w:r>
+        <w:rPr>
+          <w:i/>
+          <w:color w:val="444444"/>
+          <w:sz w:val="26"/>
+        </w:rPr>
+        <w:t xml:space="preserve">   lần, ít thay đổi sau đó).</w:t>
+      </w:r>
+    </w:p>
+    <w:p>
+      <w:pPr>
+        <w:ind w:left="720"/>
+      </w:pPr>
+      <w:r>
+        <w:rPr>
+          <w:i/>
+          <w:color w:val="444444"/>
+          <w:sz w:val="26"/>
+        </w:rPr>
+        <w:t>3. **Traveler↔Machine Assignment (log thực tế)**: traveler nào chạy</w:t>
+      </w:r>
+    </w:p>
+    <w:p>
+      <w:pPr>
+        <w:ind w:left="720"/>
+      </w:pPr>
+      <w:r>
+        <w:rPr>
+          <w:i/>
+          <w:color w:val="444444"/>
+          <w:sz w:val="26"/>
+        </w:rPr>
+        <w:t xml:space="preserve">   máy nào, lúc nào — cột MC# đã có sẵn trong Scanning Sheet, chỉ cần</w:t>
+      </w:r>
+    </w:p>
+    <w:p>
+      <w:pPr>
+        <w:ind w:left="720"/>
+      </w:pPr>
+      <w:r>
+        <w:rPr>
+          <w:i/>
+          <w:color w:val="444444"/>
+          <w:sz w:val="26"/>
+        </w:rPr>
+        <w:t xml:space="preserve">   ghi NGAY LÚC BẮT ĐẦU chạy thay vì hồi tố sau khi đóng gói xong như</w:t>
+      </w:r>
+    </w:p>
+    <w:p>
+      <w:pPr>
+        <w:ind w:left="720"/>
+      </w:pPr>
+      <w:r>
+        <w:rPr>
+          <w:i/>
+          <w:color w:val="444444"/>
+          <w:sz w:val="26"/>
+        </w:rPr>
+        <w:t xml:space="preserve">   hiện tại.</w:t>
+      </w:r>
+    </w:p>
+    <w:p>
+      <w:pPr/>
+      <w:r>
+        <w:t>&gt;</w:t>
+      </w:r>
+    </w:p>
+    <w:p>
+      <w:pPr>
+        <w:ind w:left="720"/>
+      </w:pPr>
+      <w:r>
+        <w:rPr>
+          <w:i/>
+          <w:color w:val="444444"/>
+          <w:sz w:val="26"/>
+        </w:rPr>
+        <w:t>Với cách này: hệ thống KHÔNG tự động xếp máy cho 6 traveler A-F — nhân</w:t>
+      </w:r>
+    </w:p>
+    <w:p>
+      <w:pPr>
+        <w:ind w:left="720"/>
+      </w:pPr>
+      <w:r>
+        <w:rPr>
+          <w:i/>
+          <w:color w:val="444444"/>
+          <w:sz w:val="26"/>
+        </w:rPr>
+        <w:t>viên/kế hoạch vẫn chọn máy như bình thường, hệ thống chỉ tra bảng #2 để</w:t>
+      </w:r>
+    </w:p>
+    <w:p>
+      <w:pPr>
+        <w:ind w:left="720"/>
+      </w:pPr>
+      <w:r>
+        <w:rPr>
+          <w:i/>
+          <w:color w:val="444444"/>
+          <w:sz w:val="26"/>
+        </w:rPr>
+        <w:t>cảnh báo nếu chọn máy không tương thích Part# đó (bắt lỗi con người,</w:t>
+      </w:r>
+    </w:p>
+    <w:p>
+      <w:pPr>
+        <w:ind w:left="720"/>
+      </w:pPr>
+      <w:r>
+        <w:rPr>
+          <w:i/>
+          <w:color w:val="444444"/>
+          <w:sz w:val="26"/>
+        </w:rPr>
+        <w:t>không thay con người quyết định). Khi sự cố máy: đổi trạng thái máy đó</w:t>
+      </w:r>
+    </w:p>
+    <w:p>
+      <w:pPr>
+        <w:ind w:left="720"/>
+      </w:pPr>
+      <w:r>
+        <w:rPr>
+          <w:i/>
+          <w:color w:val="444444"/>
+          <w:sz w:val="26"/>
+        </w:rPr>
+        <w:t>ở bảng #1 kèm lý do — kế hoạch tra bảng #2 biết ngay máy tương thích</w:t>
+      </w:r>
+    </w:p>
+    <w:p>
+      <w:pPr>
+        <w:ind w:left="720"/>
+      </w:pPr>
+      <w:r>
+        <w:rPr>
+          <w:i/>
+          <w:color w:val="444444"/>
+          <w:sz w:val="26"/>
+        </w:rPr>
+        <w:t>nào khác đang rảnh để chuyển traveler qua, không cần đoán. Có thể bắt</w:t>
+      </w:r>
+    </w:p>
+    <w:p>
+      <w:pPr>
+        <w:ind w:left="720"/>
+      </w:pPr>
+      <w:r>
+        <w:rPr>
+          <w:i/>
+          <w:color w:val="444444"/>
+          <w:sz w:val="26"/>
+        </w:rPr>
+        <w:t>đầu chỉ với bảng #1 (quản đốc cung cấp 1 lần) — bảng #3 tự có từ việc</w:t>
+      </w:r>
+    </w:p>
+    <w:p>
+      <w:pPr>
+        <w:ind w:left="720"/>
+      </w:pPr>
+      <w:r>
+        <w:rPr>
+          <w:i/>
+          <w:color w:val="444444"/>
+          <w:sz w:val="26"/>
+        </w:rPr>
+        <w:t>ghi Scanning Sheet đang làm sẵn.</w:t>
+      </w:r>
+    </w:p>
+    <w:p/>
+    <w:p>
       <w:pPr/>
       <w:r>
         <w:rPr>
@@ -5182,6 +5729,138 @@
                 <w:sz w:val="22"/>
               </w:rPr>
               <w:t>Xem danh sách đủ ở mục 7.1</w:t>
+            </w:r>
+          </w:p>
+        </w:tc>
+      </w:tr>
+      <w:tr>
+        <w:tc>
+          <w:tcPr>
+            <w:tcW w:type="dxa" w:w="2280"/>
+          </w:tcPr>
+          <w:p>
+            <w:pPr>
+              <w:jc w:val="left"/>
+            </w:pPr>
+            <w:r>
+              <w:rPr>
+                <w:sz w:val="22"/>
+              </w:rPr>
+            </w:r>
+            <w:r>
+              <w:rPr>
+                <w:sz w:val="22"/>
+              </w:rPr>
+              <w:t>12</w:t>
+            </w:r>
+          </w:p>
+        </w:tc>
+        <w:tc>
+          <w:tcPr>
+            <w:tcW w:type="dxa" w:w="2280"/>
+          </w:tcPr>
+          <w:p>
+            <w:pPr>
+              <w:jc w:val="left"/>
+            </w:pPr>
+            <w:r>
+              <w:rPr>
+                <w:sz w:val="22"/>
+              </w:rPr>
+            </w:r>
+            <w:r>
+              <w:rPr>
+                <w:b/>
+                <w:sz w:val="22"/>
+              </w:rPr>
+              <w:t>[MỚI 2026-09-15]</w:t>
+            </w:r>
+            <w:r>
+              <w:rPr>
+                <w:sz w:val="22"/>
+              </w:rPr>
+              <w:t xml:space="preserve"> 2 nguồn Part# lệch hậu tố (RawMaterial lúc nhận email vs FinishGood lúc scan) — khi làm Packing List, ưu tiên nguồn nào?</w:t>
+            </w:r>
+          </w:p>
+        </w:tc>
+        <w:tc>
+          <w:tcPr>
+            <w:tcW w:type="dxa" w:w="2280"/>
+          </w:tcPr>
+          <w:p>
+            <w:pPr>
+              <w:jc w:val="left"/>
+            </w:pPr>
+            <w:r>
+              <w:rPr>
+                <w:sz w:val="22"/>
+              </w:rPr>
+            </w:r>
+            <w:r>
+              <w:rPr>
+                <w:sz w:val="22"/>
+              </w:rPr>
+              <w:t>Đang chọn RawMaterial-hay-FinishGood tuỳ ý (ưu tiên FinishGood hiện tại) — sai thì lấy nhầm sản phẩm khác (hậu tố = sản phẩm khác nhau thật, đã chốt mục trên)</w:t>
+            </w:r>
+          </w:p>
+        </w:tc>
+        <w:tc>
+          <w:tcPr>
+            <w:tcW w:type="dxa" w:w="2280"/>
+          </w:tcPr>
+          <w:p>
+            <w:pPr>
+              <w:jc w:val="left"/>
+            </w:pPr>
+            <w:r>
+              <w:rPr>
+                <w:sz w:val="22"/>
+              </w:rPr>
+            </w:r>
+            <w:r>
+              <w:rPr>
+                <w:sz w:val="22"/>
+              </w:rPr>
+              <w:t xml:space="preserve">Traveler 718064: RawMaterial ghi Part# </w:t>
+            </w:r>
+            <w:r>
+              <w:rPr>
+                <w:rFonts w:ascii="Courier New" w:hAnsi="Courier New"/>
+                <w:sz w:val="22"/>
+              </w:rPr>
+              <w:t>7151143403-L</w:t>
+            </w:r>
+            <w:r>
+              <w:rPr>
+                <w:sz w:val="22"/>
+              </w:rPr>
+              <w:t xml:space="preserve">, nhưng FinishGood lúc scan chỉ ghi </w:t>
+            </w:r>
+            <w:r>
+              <w:rPr>
+                <w:rFonts w:ascii="Courier New" w:hAnsi="Courier New"/>
+                <w:sz w:val="22"/>
+              </w:rPr>
+              <w:t>7151143403</w:t>
+            </w:r>
+            <w:r>
+              <w:rPr>
+                <w:sz w:val="22"/>
+              </w:rPr>
+              <w:t xml:space="preserve"> (mất hậu tố </w:t>
+            </w:r>
+            <w:r>
+              <w:rPr>
+                <w:rFonts w:ascii="Courier New" w:hAnsi="Courier New"/>
+                <w:sz w:val="22"/>
+              </w:rPr>
+              <w:t>-L</w:t>
+            </w:r>
+            <w:r>
+              <w:rPr>
+                <w:sz w:val="22"/>
+              </w:rPr>
+              <w:t>) — PartControl không khớp được, Quantity không tự tính ra</w:t>
             </w:r>
           </w:p>
         </w:tc>
@@ -8594,6 +9273,75 @@
       <w:pPr/>
       <w:r>
         <w:t>36 carton) — chuẩn GS1 SSCC, đề xuất thêm vào hệ thống (Giai đoạn 4).</w:t>
+      </w:r>
+    </w:p>
+    <w:p/>
+    <w:p>
+      <w:pPr>
+        <w:pBdr>
+          <w:bottom w:val="single" w:sz="6" w:space="1" w:color="4472C4"/>
+        </w:pBdr>
+      </w:pPr>
+    </w:p>
+    <w:p/>
+    <w:p>
+      <w:pPr>
+        <w:pStyle w:val="Heading2"/>
+      </w:pPr>
+      <w:r>
+        <w:rPr>
+          <w:color w:val="2672C4"/>
+        </w:rPr>
+        <w:t>8. GHI CHÚ ĐỀ XUẤT UX — KHÂU 4 PACKING LIST (ghi nhận 2026-09-15, chưa code)</w:t>
+      </w:r>
+    </w:p>
+    <w:p/>
+    <w:p>
+      <w:pPr/>
+      <w:r>
+        <w:t>Andy: "khi chọn traveler, click vào thì hiển thị ra các traveler hiện đạt</w:t>
+      </w:r>
+    </w:p>
+    <w:p>
+      <w:pPr/>
+      <w:r>
+        <w:t>chất lượng, chỉ chọn tick cho nhanh" — ô "+ Thêm dòng theo Traveler#"</w:t>
+      </w:r>
+    </w:p>
+    <w:p>
+      <w:pPr/>
+      <w:r>
+        <w:t>hiện tại bắt gõ đúng số traveler; đề xuất thêm 1 chế độ **gợi ý danh sách</w:t>
+      </w:r>
+    </w:p>
+    <w:p>
+      <w:pPr/>
+      <w:r>
+        <w:t>traveler đang đạt chất lượng (PASS/Concession, chưa xuất)** ngay khi bấm</w:t>
+      </w:r>
+    </w:p>
+    <w:p>
+      <w:pPr/>
+      <w:r>
+        <w:t>vào ô đó, để chọn bằng cách tick thay vì phải nhớ/gõ đúng số — giống cách</w:t>
+      </w:r>
+    </w:p>
+    <w:p>
+      <w:pPr/>
+      <w:r>
+        <w:t>"⚡ Tạo PS tự động" đã lọc sẵn, nhưng cho phép chọn TỪNG traveler một thay</w:t>
+      </w:r>
+    </w:p>
+    <w:p>
+      <w:pPr/>
+      <w:r>
+        <w:t>vì lấy hết cùng lúc. Chưa code trong phiên này — ghi lại làm việc ưu tiên</w:t>
+      </w:r>
+    </w:p>
+    <w:p>
+      <w:pPr/>
+      <w:r>
+        <w:t>phiên sau nếu Owner đồng ý hướng này.</w:t>
       </w:r>
     </w:p>
     <w:p/>

</xml_diff>